<commit_message>
chore(jira): Jira space key renamed IMS -> IM
Co-Authored-By: Claude Opus 5.5 (1M context) <noreply@anthropic.com>
</commit_message>
<xml_diff>
--- a/out/Huong_dan_Jira_IMS.docx
+++ b/out/Huong_dan_Jira_IMS.docx
@@ -1042,7 +1042,7 @@
           <w:b/>
           <w:sz w:val="24"/>
         </w:rPr>
-        <w:t>IMS</w:t>
+        <w:t>IM</w:t>
       </w:r>
       <w:r>
         <w:rPr>
@@ -1050,7 +1050,7 @@
           <w:b w:val="0"/>
           <w:sz w:val="24"/>
         </w:rPr>
-        <w:t xml:space="preserve"> (mọi work item sẽ có mã IMS-1, IMS-2...). Bấm </w:t>
+        <w:t xml:space="preserve"> (mọi work item sẽ có mã IM-1, IM-2...). Bấm </w:t>
       </w:r>
       <w:r>
         <w:rPr>
@@ -2290,7 +2290,7 @@
           <w:b/>
           <w:sz w:val="24"/>
         </w:rPr>
-        <w:t>IMS</w:t>
+        <w:t>IM</w:t>
       </w:r>
       <w:r>
         <w:rPr>
@@ -3216,7 +3216,7 @@
           <w:b w:val="0"/>
           <w:sz w:val="24"/>
         </w:rPr>
-        <w:t>Tìm kiếm JQL để đếm: project = IMS → 131 kết quả; project = IMS AND issuetype = Subtask → 31.</w:t>
+        <w:t>Tìm kiếm JQL để đếm: project = IM → 131 kết quả; project = IM AND issuetype = Subtask → 31.</w:t>
       </w:r>
     </w:p>
     <w:p>
@@ -3246,7 +3246,7 @@
           <w:b/>
           <w:sz w:val="24"/>
         </w:rPr>
-        <w:t>project = IMS AND labels = Sprint-1 AND issuetype in (Story, Task)</w:t>
+        <w:t>project = IM AND labels = Sprint-1 AND issuetype in (Story, Task)</w:t>
       </w:r>
       <w:r>
         <w:rPr>
@@ -3284,7 +3284,7 @@
           <w:b/>
           <w:sz w:val="24"/>
         </w:rPr>
-        <w:t>project = IMS AND assignee is EMPTY</w:t>
+        <w:t>project = IM AND assignee is EMPTY</w:t>
       </w:r>
       <w:r>
         <w:rPr>
@@ -3318,7 +3318,7 @@
                 <w:b w:val="0"/>
                 <w:sz w:val="22"/>
               </w:rPr>
-              <w:t>Import sai? Xóa hàng loạt bằng JQL project = IMS → Bulk change → Delete, sửa file rồi import lại. Đừng import chồng lần 2 lên dữ liệu cũ vì sẽ bị nhân đôi.</w:t>
+              <w:t>Import sai? Xóa hàng loạt bằng JQL project = IM → Bulk change → Delete, sửa file rồi import lại. Đừng import chồng lần 2 lên dữ liệu cũ vì sẽ bị nhân đôi.</w:t>
             </w:r>
           </w:p>
         </w:tc>
@@ -3866,7 +3866,7 @@
           <w:b w:val="0"/>
           <w:sz w:val="24"/>
         </w:rPr>
-        <w:t>• Kết nối GitHub: Apps → GitHub for Jira; đặt tên nhánh/commit chứa mã IMS-xx để Jira tự gắn code vào work item.</w:t>
+        <w:t>• Kết nối GitHub: Apps → GitHub for Jira; đặt tên nhánh/commit chứa mã IM-xx để Jira tự gắn code vào work item.</w:t>
       </w:r>
     </w:p>
     <w:p>
@@ -4398,7 +4398,7 @@
           <w:b w:val="0"/>
           <w:sz w:val="24"/>
         </w:rPr>
-        <w:t>Tạo project Scrum company-managed, key IMS.</w:t>
+        <w:t>Tạo project Scrum company-managed, key IM.</w:t>
       </w:r>
     </w:p>
     <w:p>

</xml_diff>